<commit_message>
refactor: misc. content changes
</commit_message>
<xml_diff>
--- a/react-angular/extracted-notes/react-angular-part-1.docx
+++ b/react-angular/extracted-notes/react-angular-part-1.docx
@@ -517,7 +517,7 @@
           <w:noProof/>
         </w:rPr>
         <w:drawing>
-          <wp:inline distT="0" distB="0" distL="0" distR="0" wp14:anchorId="6023072F" wp14:editId="1BB525E3">
+          <wp:inline distT="0" distB="0" distL="0" distR="0" wp14:anchorId="6023072F" wp14:editId="619B1A2C">
             <wp:extent cx="3269440" cy="3072003"/>
             <wp:effectExtent l="0" t="0" r="7620" b="0"/>
             <wp:docPr id="1329410350" name="Picture 2"/>
@@ -571,17 +571,179 @@
         </w:drawing>
       </w:r>
     </w:p>
-    <w:p/>
-    <w:p/>
-    <w:p/>
-    <w:p/>
-    <w:p/>
-    <w:p/>
-    <w:p/>
-    <w:p/>
-    <w:p/>
-    <w:p/>
-    <w:p/>
+    <w:p>
+      <w:pPr>
+        <w:pStyle w:val="Heading1"/>
+      </w:pPr>
+      <w:r>
+        <w:t>TanStack Query Foundations</w:t>
+      </w:r>
+    </w:p>
+    <w:p>
+      <w:r>
+        <w:t>It is JS/TS library that helps with data fetching and server-state synchronization.</w:t>
+      </w:r>
+      <w:r>
+        <w:t xml:space="preserve"> It solves managing state with useState, useEffect and fetch, handling multiple loading, error and success states, managing sync and cached date between client and server.</w:t>
+      </w:r>
+    </w:p>
+    <w:p>
+      <w:r>
+        <w:lastRenderedPageBreak/>
+        <w:drawing>
+          <wp:inline distT="0" distB="0" distL="0" distR="0" wp14:anchorId="44E42EC6" wp14:editId="00E333FB">
+            <wp:extent cx="5702593" cy="1600282"/>
+            <wp:effectExtent l="0" t="0" r="0" b="0"/>
+            <wp:docPr id="814779857" name="Picture 1"/>
+            <wp:cNvGraphicFramePr>
+              <a:graphicFrameLocks xmlns:a="http://schemas.openxmlformats.org/drawingml/2006/main" noChangeAspect="1"/>
+            </wp:cNvGraphicFramePr>
+            <a:graphic xmlns:a="http://schemas.openxmlformats.org/drawingml/2006/main">
+              <a:graphicData uri="http://schemas.openxmlformats.org/drawingml/2006/picture">
+                <pic:pic xmlns:pic="http://schemas.openxmlformats.org/drawingml/2006/picture">
+                  <pic:nvPicPr>
+                    <pic:cNvPr id="814779857" name=""/>
+                    <pic:cNvPicPr/>
+                  </pic:nvPicPr>
+                  <pic:blipFill>
+                    <a:blip r:embed="rId13"/>
+                    <a:stretch>
+                      <a:fillRect/>
+                    </a:stretch>
+                  </pic:blipFill>
+                  <pic:spPr>
+                    <a:xfrm>
+                      <a:off x="0" y="0"/>
+                      <a:ext cx="5702593" cy="1600282"/>
+                    </a:xfrm>
+                    <a:prstGeom prst="rect">
+                      <a:avLst/>
+                    </a:prstGeom>
+                  </pic:spPr>
+                </pic:pic>
+              </a:graphicData>
+            </a:graphic>
+          </wp:inline>
+        </w:drawing>
+      </w:r>
+    </w:p>
+    <w:p>
+      <w:r>
+        <w:drawing>
+          <wp:inline distT="0" distB="0" distL="0" distR="0" wp14:anchorId="4FFFBACA" wp14:editId="20ADB319">
+            <wp:extent cx="4953255" cy="1739989"/>
+            <wp:effectExtent l="0" t="0" r="0" b="0"/>
+            <wp:docPr id="1603616217" name="Picture 1"/>
+            <wp:cNvGraphicFramePr>
+              <a:graphicFrameLocks xmlns:a="http://schemas.openxmlformats.org/drawingml/2006/main" noChangeAspect="1"/>
+            </wp:cNvGraphicFramePr>
+            <a:graphic xmlns:a="http://schemas.openxmlformats.org/drawingml/2006/main">
+              <a:graphicData uri="http://schemas.openxmlformats.org/drawingml/2006/picture">
+                <pic:pic xmlns:pic="http://schemas.openxmlformats.org/drawingml/2006/picture">
+                  <pic:nvPicPr>
+                    <pic:cNvPr id="1603616217" name=""/>
+                    <pic:cNvPicPr/>
+                  </pic:nvPicPr>
+                  <pic:blipFill>
+                    <a:blip r:embed="rId14"/>
+                    <a:stretch>
+                      <a:fillRect/>
+                    </a:stretch>
+                  </pic:blipFill>
+                  <pic:spPr>
+                    <a:xfrm>
+                      <a:off x="0" y="0"/>
+                      <a:ext cx="4953255" cy="1739989"/>
+                    </a:xfrm>
+                    <a:prstGeom prst="rect">
+                      <a:avLst/>
+                    </a:prstGeom>
+                  </pic:spPr>
+                </pic:pic>
+              </a:graphicData>
+            </a:graphic>
+          </wp:inline>
+        </w:drawing>
+      </w:r>
+    </w:p>
+    <w:p>
+      <w:r>
+        <w:t>We can also use the concept such as cache invalidation, background fetching (re</w:t>
+      </w:r>
+      <w:r>
+        <w:t>-</w:t>
+      </w:r>
+      <w:r>
+        <w:t>fetch data without replacing currently visible data)</w:t>
+      </w:r>
+      <w:r>
+        <w:t xml:space="preserve"> because of this TanStack query applications feel so responsive, it uses HTTP cache feature stale-while-revalidate pattern.</w:t>
+      </w:r>
+      <w:r>
+        <w:t xml:space="preserve"> We can also use staleTime and gcTime (“garbage collection time” – how long it takes for data to be removed from memory after data is longer being used by component</w:t>
+      </w:r>
+      <w:r>
+        <w:t xml:space="preserve"> like when we move from the component to another component</w:t>
+      </w:r>
+      <w:r>
+        <w:t>).</w:t>
+      </w:r>
+    </w:p>
+    <w:p>
+      <w:r>
+        <w:t xml:space="preserve">The useQuery Lifecycle – </w:t>
+      </w:r>
+    </w:p>
+    <w:p>
+      <w:r>
+        <w:drawing>
+          <wp:inline distT="0" distB="0" distL="0" distR="0" wp14:anchorId="3BCA6C7A" wp14:editId="442B946E">
+            <wp:extent cx="6351563" cy="3271643"/>
+            <wp:effectExtent l="0" t="0" r="0" b="5080"/>
+            <wp:docPr id="961317248" name="Picture 1"/>
+            <wp:cNvGraphicFramePr>
+              <a:graphicFrameLocks xmlns:a="http://schemas.openxmlformats.org/drawingml/2006/main" noChangeAspect="1"/>
+            </wp:cNvGraphicFramePr>
+            <a:graphic xmlns:a="http://schemas.openxmlformats.org/drawingml/2006/main">
+              <a:graphicData uri="http://schemas.openxmlformats.org/drawingml/2006/picture">
+                <pic:pic xmlns:pic="http://schemas.openxmlformats.org/drawingml/2006/picture">
+                  <pic:nvPicPr>
+                    <pic:cNvPr id="961317248" name=""/>
+                    <pic:cNvPicPr/>
+                  </pic:nvPicPr>
+                  <pic:blipFill>
+                    <a:blip r:embed="rId15"/>
+                    <a:stretch>
+                      <a:fillRect/>
+                    </a:stretch>
+                  </pic:blipFill>
+                  <pic:spPr>
+                    <a:xfrm>
+                      <a:off x="0" y="0"/>
+                      <a:ext cx="6355331" cy="3273584"/>
+                    </a:xfrm>
+                    <a:prstGeom prst="rect">
+                      <a:avLst/>
+                    </a:prstGeom>
+                  </pic:spPr>
+                </pic:pic>
+              </a:graphicData>
+            </a:graphic>
+          </wp:inline>
+        </w:drawing>
+      </w:r>
+    </w:p>
+    <w:p>
+      <w:r>
+        <w:t>It also supports mutations concept for optimistic updates and pagination</w:t>
+      </w:r>
+      <w:r>
+        <w:t xml:space="preserve"> for large records handling</w:t>
+      </w:r>
+      <w:r>
+        <w:t>.</w:t>
+      </w:r>
+    </w:p>
     <w:p/>
     <w:sectPr>
       <w:pgSz w:w="12240" w:h="15840"/>
@@ -1197,7 +1359,6 @@
   <w:style w:type="character" w:default="1" w:styleId="DefaultParagraphFont">
     <w:name w:val="Default Paragraph Font"/>
     <w:uiPriority w:val="1"/>
-    <w:semiHidden/>
     <w:unhideWhenUsed/>
   </w:style>
   <w:style w:type="table" w:default="1" w:styleId="TableNormal">

</xml_diff>